<commit_message>
Evaristo Costa: revisão da parte 3
Co-Authored-By: Claude Opus 5.5 <noreply@anthropic.com>
Claude-Session: https://claude.ai/code/session_01MJjUEEZrxQDEUifKK2vj9g
</commit_message>
<xml_diff>
--- a/roteiros/evaristo-costa/EvaristoCosta_Parte3.docx
+++ b/roteiros/evaristo-costa/EvaristoCosta_Parte3.docx
@@ -15,7 +15,7 @@
         <w:rPr>
           <w:color w:val="000000"/>
         </w:rPr>
-        <w:t>Para entender essa guerra, é preciso voltar um pouco. Para antes da CNN, antes da demissão, antes de qualquer manchete.</w:t>
+        <w:t>Para entender essa guerra, é preciso voltar um pouco. Para antes da CNN e da demissão.</w:t>
       </w:r>
     </w:p>
     <w:p>
@@ -31,7 +31,7 @@
         <w:rPr>
           <w:color w:val="000000"/>
         </w:rPr>
-        <w:t>Evaristo vivia exatamente a vida que tinha escolhido. Longe da pressão da televisão, com as filhas na escola e a mulher estudando numa das universidades mais famosas do mundo.</w:t>
+        <w:t>Evaristo vivia exatamente a vida que tinha escolhido. Longe da pressão da televisão, com a mulher estudando numa das universidades mais famosas do mundo.</w:t>
       </w:r>
     </w:p>
     <w:p>
@@ -111,7 +111,7 @@
         <w:rPr>
           <w:color w:val="000000"/>
         </w:rPr>
-        <w:t>No começo, Evaristo achou que era a comida. Culpou a alimentação, os horários bagunçados das viagens ao Brasil, a rotina nova. Acreditou que, com o tempo, aquilo ia passar sozinho.</w:t>
+        <w:t>No começo, Evaristo achou que era a alimentação. Acreditou que, com o tempo, aquilo ia passar sozinho.</w:t>
       </w:r>
     </w:p>
     <w:p>
@@ -119,7 +119,7 @@
         <w:rPr>
           <w:color w:val="000000"/>
         </w:rPr>
-        <w:t>Evaristo contou depois que perdeu a força para as coisas mais banais do dia a dia, de sair da cama a levar as filhas à escola. A bicicleta, que tinha virado parte da rotina em Cambridge, ficou encostada.</w:t>
+        <w:t>Evaristo contou depois que perdeu a força para as coisas mais banais do dia a dia, de sair da cama a levar as filhas à escola. Até andar de bicicleta, que tinha virado parte da rotina em Cambridge, ficou pesado demais.</w:t>
       </w:r>
     </w:p>
     <w:p>
@@ -151,7 +151,7 @@
         <w:rPr>
           <w:color w:val="000000"/>
         </w:rPr>
-        <w:t>Existe um tipo de sofrimento que quase ninguém tem coragem de contar em voz alta. Dor de cabeça, a gente comenta no almoço. Dor nas costas, vira assunto no elevador. Agora, intestino e noites sem dormir por causa da barriga, isso as pessoas escondem. Por vergonha ou por medo do que os outros vão pensar.</w:t>
+        <w:t>Existe um tipo de sofrimento que quase ninguém tem coragem de contar em voz alta. Dor de cabeça, a gente comenta no almoço. Agora, intestino e noites sem dormir por causa da barriga, isso as pessoas escondem. Por vergonha ou por medo do que os outros vão pensar.</w:t>
       </w:r>
     </w:p>
     <w:p>
@@ -159,7 +159,7 @@
         <w:rPr>
           <w:color w:val="000000"/>
         </w:rPr>
-        <w:t>E Evaristo não era uma pessoa qualquer. Era um homem que vivia da própria imagem. Cada foto dele era vista por milhões. Cada vídeo virava comentário.</w:t>
+        <w:t>Evaristo vivia da própria imagem. Cada foto dele era vista por milhões, e cada vídeo virava comentário.</w:t>
       </w:r>
     </w:p>
     <w:p>
@@ -183,7 +183,7 @@
         <w:rPr>
           <w:color w:val="C00000"/>
         </w:rPr>
-        <w:t>Agora pense no que isso significa para alguém que vive da própria imagem. Porque, enquanto tudo isso acontecia, Evaristo continuava postando vídeos engraçados e negociando um contrato com a CNN. Do lado de fora, o público só via o sorriso.</w:t>
+        <w:t>Repare numa contradição cruel. Enquanto tudo isso acontecia, Evaristo continuava postando vídeos engraçados e negociando um contrato com a CNN. Do lado de fora, o público só via o sorriso.</w:t>
       </w:r>
     </w:p>
     <w:p>
@@ -247,7 +247,7 @@
         <w:rPr>
           <w:color w:val="000000"/>
         </w:rPr>
-        <w:t>Ele percebeu uma coisa estranha. Toda vez que tomava o comprimido, a dor aumentava. E ela não ficava onde deveria ficar. Descia. Instalava-se mais para baixo da barriga, longe do lugar que o remédio deveria tratar.</w:t>
+        <w:t>Ele percebeu uma coisa estranha. Toda vez que tomava o comprimido, a dor aumentava. E ela não ficava onde deveria ficar. Descia. Ia para a parte de baixo da barriga, longe do lugar que o remédio deveria tratar.</w:t>
       </w:r>
     </w:p>
     <w:p>
@@ -287,7 +287,7 @@
         <w:rPr>
           <w:color w:val="000000"/>
         </w:rPr>
-        <w:t>Os pais de Evaristo, os amigos de infância e tudo o que ele conhecia do Brasil estavam do outro lado do oceano. Com os voos cancelados e as fronteiras fechadas, a distância, que antes era uma escolha, virou um muro.</w:t>
+        <w:t>A família no Brasil e os amigos de infância estavam do outro lado do oceano. Com os voos cancelados e as fronteiras fechadas, a distância, que antes era uma escolha, virou um muro.</w:t>
       </w:r>
     </w:p>
     <w:p>
@@ -295,7 +295,7 @@
         <w:rPr>
           <w:color w:val="000000"/>
         </w:rPr>
-        <w:t>Em maio de dois mil e vinte, o programa dele finalmente estreou. Toda semana, Evaristo apresentava documentários sobre a vida de outras pessoas, histórias de superação e de sofrimento contadas para o Brasil inteiro. A história que ele mesmo estava vivendo, o público não conhecia.</w:t>
+        <w:t>Em maio de dois mil e vinte, o programa dele finalmente estreou. Toda semana, Evaristo apresentava documentários jornalísticos sobre histórias de outras pessoas, contadas para o Brasil inteiro. A história que ele mesmo estava vivendo, o público não conhecia.</w:t>
       </w:r>
     </w:p>
     <w:p>
@@ -375,15 +375,7 @@
         <w:rPr>
           <w:color w:val="1F4EB4"/>
         </w:rPr>
-        <w:t>Mais para baixo. O corpo estava dando a pista o tempo todo.</w:t>
-      </w:r>
-    </w:p>
-    <w:p>
-      <w:r>
-        <w:rPr>
-          <w:color w:val="1F4EB4"/>
-        </w:rPr>
-        <w:t>O problema de Evaristo estava mais abaixo, exatamente onde ele sentia a dor. No intestino.</w:t>
+        <w:t>Mais para baixo. O corpo estava dando a pista o tempo todo. O problema estava exatamente onde ele sentia a dor. No intestino.</w:t>
       </w:r>
     </w:p>
     <w:p>
@@ -423,7 +415,7 @@
         <w:rPr>
           <w:color w:val="1F4EB4"/>
         </w:rPr>
-        <w:t>Durante um ano, um homem conhecido por milhões de brasileiros viveu assim, tomando todos os dias um comprimido para uma doença que ele não tinha.</w:t>
+        <w:t>Um homem conhecido por milhões de brasileiros viveu assim, tomando todos os dias um comprimido para uma doença que ele não tinha.</w:t>
       </w:r>
     </w:p>
     <w:p>

</xml_diff>